<commit_message>
docs(006): capturas reales en el entregable 2 (rutas, consola y QR)
Co-Authored-By: Claude Opus 5.5 <noreply@anthropic.com>
</commit_message>
<xml_diff>
--- a/docs/specs/006-validacion-pitch-entrega/materiales/entregable-2/IstpetDev-Entregable-2-Solucion.docx
+++ b/docs/specs/006-validacion-pitch-entrega/materiales/entregable-2/IstpetDev-Entregable-2-Solucion.docx
@@ -1239,7 +1239,61 @@
           <w:color w:val="64748B"/>
           <w:sz w:val="19"/>
         </w:rPr>
-        <w:t>Capturas del prototipo desplegado (escenario demo-region).</w:t>
+        <w:t>Capturas del prototipo desplegado en https://istpetdev.doicela.dev, 16-oct-2026.</w:t>
+      </w:r>
+    </w:p>
+    <w:p>
+      <w:pPr>
+        <w:jc w:val="center"/>
+      </w:pPr>
+      <w:r>
+        <w:drawing>
+          <wp:inline xmlns:a="http://schemas.openxmlformats.org/drawingml/2006/main" xmlns:pic="http://schemas.openxmlformats.org/drawingml/2006/picture">
+            <wp:extent cx="5976000" cy="3150215"/>
+            <wp:docPr id="3" name="Picture 3"/>
+            <wp:cNvGraphicFramePr>
+              <a:graphicFrameLocks noChangeAspect="1"/>
+            </wp:cNvGraphicFramePr>
+            <a:graphic>
+              <a:graphicData uri="http://schemas.openxmlformats.org/drawingml/2006/picture">
+                <pic:pic>
+                  <pic:nvPicPr>
+                    <pic:cNvPr id="0" name="captura-rutas.png"/>
+                    <pic:cNvPicPr/>
+                  </pic:nvPicPr>
+                  <pic:blipFill>
+                    <a:blip r:embed="rId12"/>
+                    <a:stretch>
+                      <a:fillRect/>
+                    </a:stretch>
+                  </pic:blipFill>
+                  <pic:spPr>
+                    <a:xfrm>
+                      <a:off x="0" y="0"/>
+                      <a:ext cx="5976000" cy="3150215"/>
+                    </a:xfrm>
+                    <a:prstGeom prst="rect"/>
+                  </pic:spPr>
+                </pic:pic>
+              </a:graphicData>
+            </a:graphic>
+          </wp:inline>
+        </w:drawing>
+      </w:r>
+    </w:p>
+    <w:p>
+      <w:pPr>
+        <w:spacing w:after="160"/>
+        <w:jc w:val="center"/>
+      </w:pPr>
+      <w:r>
+        <w:rPr>
+          <w:b w:val="0"/>
+          <w:i w:val="0"/>
+          <w:color w:val="64748B"/>
+          <w:sz w:val="17"/>
+        </w:rPr>
+        <w:t>Figura 2. Planificación de rutas: seis vehículos, paradas numeradas sobre calles reales, ventanas horarias y hora estimada de llegada.</w:t>
       </w:r>
     </w:p>
     <w:tbl>
@@ -1258,8 +1312,8 @@
         <w:tblLayout w:type="fixed"/>
       </w:tblPr>
       <w:tblGrid>
-        <w:gridCol w:w="4706"/>
-        <w:gridCol w:w="4706"/>
+        <w:gridCol w:w="6690"/>
+        <w:gridCol w:w="2721"/>
       </w:tblGrid>
       <w:tr>
         <w:trPr>
@@ -1267,7 +1321,8 @@
         </w:trPr>
         <w:tc>
           <w:tcPr>
-            <w:tcW w:type="dxa" w:w="4706"/>
+            <w:tcW w:type="dxa" w:w="6690"/>
+            <w:vAlign w:val="center"/>
           </w:tcPr>
           <w:p>
             <w:pPr>
@@ -1276,8 +1331,8 @@
             <w:r>
               <w:drawing>
                 <wp:inline xmlns:a="http://schemas.openxmlformats.org/drawingml/2006/main" xmlns:pic="http://schemas.openxmlformats.org/drawingml/2006/picture">
-                  <wp:extent cx="2844000" cy="1688625"/>
-                  <wp:docPr id="3" name="Picture 3"/>
+                  <wp:extent cx="4031999" cy="2125446"/>
+                  <wp:docPr id="4" name="Picture 4"/>
                   <wp:cNvGraphicFramePr>
                     <a:graphicFrameLocks noChangeAspect="1"/>
                   </wp:cNvGraphicFramePr>
@@ -1285,11 +1340,11 @@
                     <a:graphicData uri="http://schemas.openxmlformats.org/drawingml/2006/picture">
                       <pic:pic>
                         <pic:nvPicPr>
-                          <pic:cNvPr id="0" name="captura-1.png"/>
+                          <pic:cNvPr id="0" name="captura-consola.png"/>
                           <pic:cNvPicPr/>
                         </pic:nvPicPr>
                         <pic:blipFill>
-                          <a:blip r:embed="rId12"/>
+                          <a:blip r:embed="rId13"/>
                           <a:stretch>
                             <a:fillRect/>
                           </a:stretch>
@@ -1297,7 +1352,7 @@
                         <pic:spPr>
                           <a:xfrm>
                             <a:off x="0" y="0"/>
-                            <a:ext cx="2844000" cy="1688625"/>
+                            <a:ext cx="4031999" cy="2125446"/>
                           </a:xfrm>
                           <a:prstGeom prst="rect"/>
                         </pic:spPr>
@@ -1310,7 +1365,7 @@
           </w:p>
           <w:p>
             <w:pPr>
-              <w:spacing w:after="160"/>
+              <w:spacing w:after="80"/>
               <w:jc w:val="center"/>
             </w:pPr>
             <w:r>
@@ -1320,13 +1375,14 @@
                 <w:color w:val="64748B"/>
                 <w:sz w:val="17"/>
               </w:rPr>
-              <w:t>Figura 2. Alertas de riesgo con la explicación del cálculo.</w:t>
+              <w:t>Figura 3. Consola de control: red de 80 centros de salud, riesgo de stock, rutas y custodia digital.</w:t>
             </w:r>
           </w:p>
         </w:tc>
         <w:tc>
           <w:tcPr>
-            <w:tcW w:type="dxa" w:w="4706"/>
+            <w:tcW w:type="dxa" w:w="2721"/>
+            <w:vAlign w:val="center"/>
           </w:tcPr>
           <w:p>
             <w:pPr>
@@ -1335,8 +1391,8 @@
             <w:r>
               <w:drawing>
                 <wp:inline xmlns:a="http://schemas.openxmlformats.org/drawingml/2006/main" xmlns:pic="http://schemas.openxmlformats.org/drawingml/2006/picture">
-                  <wp:extent cx="2844000" cy="1688625"/>
-                  <wp:docPr id="4" name="Picture 4"/>
+                  <wp:extent cx="1047681" cy="2376000"/>
+                  <wp:docPr id="5" name="Picture 5"/>
                   <wp:cNvGraphicFramePr>
                     <a:graphicFrameLocks noChangeAspect="1"/>
                   </wp:cNvGraphicFramePr>
@@ -1344,11 +1400,12 @@
                     <a:graphicData uri="http://schemas.openxmlformats.org/drawingml/2006/picture">
                       <pic:pic>
                         <pic:nvPicPr>
-                          <pic:cNvPr id="0" name="captura-2.png"/>
+                          <pic:cNvPr id="0" name="captura-qr.png"/>
                           <pic:cNvPicPr/>
                         </pic:nvPicPr>
                         <pic:blipFill>
-                          <a:blip r:embed="rId13"/>
+                          <a:blip r:embed="rId14"/>
+                          <a:srcRect r="18000"/>
                           <a:stretch>
                             <a:fillRect/>
                           </a:stretch>
@@ -1356,7 +1413,7 @@
                         <pic:spPr>
                           <a:xfrm>
                             <a:off x="0" y="0"/>
-                            <a:ext cx="2844000" cy="1688625"/>
+                            <a:ext cx="1047681" cy="2376000"/>
                           </a:xfrm>
                           <a:prstGeom prst="rect"/>
                         </pic:spPr>
@@ -1369,7 +1426,7 @@
           </w:p>
           <w:p>
             <w:pPr>
-              <w:spacing w:after="160"/>
+              <w:spacing w:after="80"/>
               <w:jc w:val="center"/>
             </w:pPr>
             <w:r>
@@ -1379,135 +1436,17 @@
                 <w:color w:val="64748B"/>
                 <w:sz w:val="17"/>
               </w:rPr>
-              <w:t>Figura 3. Ruta priorizada sobre el mapa, con paradas y carga.</w:t>
-            </w:r>
-          </w:p>
-        </w:tc>
-      </w:tr>
-      <w:tr>
-        <w:trPr>
-          <w:cantSplit/>
-        </w:trPr>
-        <w:tc>
-          <w:tcPr>
-            <w:tcW w:type="dxa" w:w="4706"/>
-          </w:tcPr>
-          <w:p>
-            <w:pPr>
-              <w:jc w:val="center"/>
-            </w:pPr>
-            <w:r>
-              <w:drawing>
-                <wp:inline xmlns:a="http://schemas.openxmlformats.org/drawingml/2006/main" xmlns:pic="http://schemas.openxmlformats.org/drawingml/2006/picture">
-                  <wp:extent cx="2844000" cy="1688625"/>
-                  <wp:docPr id="5" name="Picture 5"/>
-                  <wp:cNvGraphicFramePr>
-                    <a:graphicFrameLocks noChangeAspect="1"/>
-                  </wp:cNvGraphicFramePr>
-                  <a:graphic>
-                    <a:graphicData uri="http://schemas.openxmlformats.org/drawingml/2006/picture">
-                      <pic:pic>
-                        <pic:nvPicPr>
-                          <pic:cNvPr id="0" name="captura-3.png"/>
-                          <pic:cNvPicPr/>
-                        </pic:nvPicPr>
-                        <pic:blipFill>
-                          <a:blip r:embed="rId14"/>
-                          <a:stretch>
-                            <a:fillRect/>
-                          </a:stretch>
-                        </pic:blipFill>
-                        <pic:spPr>
-                          <a:xfrm>
-                            <a:off x="0" y="0"/>
-                            <a:ext cx="2844000" cy="1688625"/>
-                          </a:xfrm>
-                          <a:prstGeom prst="rect"/>
-                        </pic:spPr>
-                      </pic:pic>
-                    </a:graphicData>
-                  </a:graphic>
-                </wp:inline>
-              </w:drawing>
-            </w:r>
-          </w:p>
-          <w:p>
-            <w:pPr>
-              <w:spacing w:after="160"/>
-              <w:jc w:val="center"/>
-            </w:pPr>
-            <w:r>
-              <w:rPr>
-                <w:b w:val="0"/>
-                <w:i w:val="0"/>
-                <w:color w:val="64748B"/>
-                <w:sz w:val="17"/>
-              </w:rPr>
-              <w:t>Figura 4. Aplicación de campo: escaneo QR y recepción.</w:t>
-            </w:r>
-          </w:p>
-        </w:tc>
-        <w:tc>
-          <w:tcPr>
-            <w:tcW w:type="dxa" w:w="4706"/>
-          </w:tcPr>
-          <w:p>
-            <w:pPr>
-              <w:jc w:val="center"/>
-            </w:pPr>
-            <w:r>
-              <w:drawing>
-                <wp:inline xmlns:a="http://schemas.openxmlformats.org/drawingml/2006/main" xmlns:pic="http://schemas.openxmlformats.org/drawingml/2006/picture">
-                  <wp:extent cx="2844000" cy="1688625"/>
-                  <wp:docPr id="6" name="Picture 6"/>
-                  <wp:cNvGraphicFramePr>
-                    <a:graphicFrameLocks noChangeAspect="1"/>
-                  </wp:cNvGraphicFramePr>
-                  <a:graphic>
-                    <a:graphicData uri="http://schemas.openxmlformats.org/drawingml/2006/picture">
-                      <pic:pic>
-                        <pic:nvPicPr>
-                          <pic:cNvPr id="0" name="captura-4.png"/>
-                          <pic:cNvPicPr/>
-                        </pic:nvPicPr>
-                        <pic:blipFill>
-                          <a:blip r:embed="rId15"/>
-                          <a:stretch>
-                            <a:fillRect/>
-                          </a:stretch>
-                        </pic:blipFill>
-                        <pic:spPr>
-                          <a:xfrm>
-                            <a:off x="0" y="0"/>
-                            <a:ext cx="2844000" cy="1688625"/>
-                          </a:xfrm>
-                          <a:prstGeom prst="rect"/>
-                        </pic:spPr>
-                      </pic:pic>
-                    </a:graphicData>
-                  </a:graphic>
-                </wp:inline>
-              </w:drawing>
-            </w:r>
-          </w:p>
-          <w:p>
-            <w:pPr>
-              <w:spacing w:after="160"/>
-              <w:jc w:val="center"/>
-            </w:pPr>
-            <w:r>
-              <w:rPr>
-                <w:b w:val="0"/>
-                <w:i w:val="0"/>
-                <w:color w:val="64748B"/>
-                <w:sz w:val="17"/>
-              </w:rPr>
-              <w:t>Figura 5. Simulación de 90 días frente a los métodos actuales.</w:t>
+              <w:t>Figura 4. Aplicación de campo: escaneo del QR de cada bulto, también sin conexión.</w:t>
             </w:r>
           </w:p>
         </w:tc>
       </w:tr>
     </w:tbl>
+    <w:p>
+      <w:pPr>
+        <w:spacing w:after="120"/>
+      </w:pPr>
+    </w:p>
     <w:p>
       <w:pPr>
         <w:pStyle w:val="Heading1"/>
@@ -1536,6 +1475,7 @@
     <w:tbl>
       <w:tblPr>
         <w:tblW w:type="auto" w:w="0"/>
+        <w:tblLayout w:type="fixed"/>
         <w:tblLook w:firstColumn="1" w:firstRow="1" w:lastColumn="0" w:lastRow="0" w:noHBand="0" w:noVBand="1" w:val="04A0"/>
         <w:tblBorders>
           <w:top w:val="single" w:sz="8" w:color="00A7C4"/>
@@ -1545,14 +1485,18 @@
           <w:insideH w:val="single" w:sz="8" w:color="00A7C4"/>
           <w:insideV w:val="single" w:sz="8" w:color="00A7C4"/>
         </w:tblBorders>
+        <w:tblLayout w:type="fixed"/>
       </w:tblPr>
       <w:tblGrid>
-        <w:gridCol w:w="9412"/>
+        <w:gridCol w:w="9411"/>
       </w:tblGrid>
       <w:tr>
+        <w:trPr>
+          <w:cantSplit/>
+        </w:trPr>
         <w:tc>
           <w:tcPr>
-            <w:tcW w:type="dxa" w:w="9412"/>
+            <w:tcW w:type="dxa" w:w="9411"/>
             <w:shd w:val="clear" w:color="auto" w:fill="E0F7FB"/>
           </w:tcPr>
           <w:p>

</xml_diff>

<commit_message>
docs(entregables): los 7 entregables oficiales en PDF dentro de docs/boveda/Entregable
Los PDF quedan juntos y portables; los Word y generadores viven en
specs/006/materiales/entregables. El entregable 2 se regenera con la
versión del 17-oct y el 7 es pitch-v4.pdf.

Co-Authored-By: Claude Sonnet 5.5 <noreply@anthropic.com>
</commit_message>
<xml_diff>
--- a/docs/specs/006-validacion-pitch-entrega/materiales/entregable-2/IstpetDev-Entregable-2-Solucion.docx
+++ b/docs/specs/006-validacion-pitch-entrega/materiales/entregable-2/IstpetDev-Entregable-2-Solucion.docx
@@ -275,7 +275,7 @@
                 <w:color w:val="2D3748"/>
                 <w:sz w:val="22"/>
               </w:rPr>
-              <w:t>16 de octubre de 2026</w:t>
+              <w:t>17 de octubre de 2026</w:t>
             </w:r>
           </w:p>
           <w:p>
@@ -331,7 +331,7 @@
                 <w:color w:val="2D3748"/>
                 <w:sz w:val="22"/>
               </w:rPr>
-              <w:t>Borrador para el Checkpoint de avances</w:t>
+              <w:t>Versión para la entrega del 17 de octubre de 2026</w:t>
             </w:r>
           </w:p>
         </w:tc>

</xml_diff>

<commit_message>
docs(pitch): correcciones de la auditoría previa a la presentación
Retira el 9,8 % de ahorro de los entregables 4 y 6: la corrida del 17-oct
sobre demo-quito-planificacion no lo sostiene (IstpetDev cuesta más que el
calendario fijo semanal). E4 pasa a publicar esa corrida con su lectura.

Guion y láminas: el recorrido sin señal vuelve a figurar como siguiente fase
(no se ha ensayado en teléfono real), «Probado» pasa a «Ensayado», el globo
de Chillo deja de decir que la IA planifica rutas y se quitan de las láminas
los códigos internos (#285, PR, matriz P-xx/A-xx, run n8n).

Unifica la escala en 40 puntos (Quito sintético) y documenta la de la demo
en vivo; corrige los pesos del puntaje A/B/C (35/35/20/10) en E3.

Regenera pitch v7, copia de revisión v8, guion v8 y PDFs de Entregable/.

Co-Authored-By: Claude Sonnet 5.5 <noreply@anthropic.com>
</commit_message>
<xml_diff>
--- a/docs/specs/006-validacion-pitch-entrega/materiales/entregable-2/IstpetDev-Entregable-2-Solucion.docx
+++ b/docs/specs/006-validacion-pitch-entrega/materiales/entregable-2/IstpetDev-Entregable-2-Solucion.docx
@@ -1293,7 +1293,7 @@
           <w:color w:val="64748B"/>
           <w:sz w:val="17"/>
         </w:rPr>
-        <w:t>Figura 2. Planificación de rutas: seis vehículos, paradas numeradas sobre calles reales, ventanas horarias y hora estimada de llegada.</w:t>
+        <w:t>Figura 2. Planificación de rutas en la escena de demostración (datos sintéticos): paradas numeradas sobre calles reales, ventanas horarias y hora estimada de llegada.</w:t>
       </w:r>
     </w:p>
     <w:tbl>
@@ -1375,7 +1375,7 @@
                 <w:color w:val="64748B"/>
                 <w:sz w:val="17"/>
               </w:rPr>
-              <w:t>Figura 3. Consola de control: red de 80 centros de salud, riesgo de stock, rutas y custodia digital.</w:t>
+              <w:t>Figura 3. Consola de control con datos sintéticos: riesgo de stock, rutas y custodia digital.</w:t>
             </w:r>
           </w:p>
         </w:tc>
@@ -1963,7 +1963,7 @@
           <w:color w:val="2D3748"/>
           <w:sz w:val="21"/>
         </w:rPr>
-        <w:t>una región con unos 15 puntos y 2 vehículos. La escala de 80 puntos y 90 días se presenta como simulación con datos sintéticos.</w:t>
+        <w:t>una región con unos 15 puntos y 2 vehículos. La simulación de 90 días usa el escenario sintético de Quito (40 puntos) y no es una medición.</w:t>
       </w:r>
     </w:p>
     <w:p>

</xml_diff>

<commit_message>
docs(pitch): correcciones de la auditoría previa a la presentación (#373)
Retira el 9,8 % de ahorro de los entregables 4 y 6: la corrida del 17-oct
sobre demo-quito-planificacion no lo sostiene (IstpetDev cuesta más que el
calendario fijo semanal). E4 pasa a publicar esa corrida con su lectura.

Guion y láminas: el recorrido sin señal vuelve a figurar como siguiente fase
(no se ha ensayado en teléfono real), «Probado» pasa a «Ensayado», el globo
de Chillo deja de decir que la IA planifica rutas y se quitan de las láminas
los códigos internos (#285, PR, matriz P-xx/A-xx, run n8n).

Unifica la escala en 40 puntos (Quito sintético) y documenta la de la demo
en vivo; corrige los pesos del puntaje A/B/C (35/35/20/10) en E3.

Regenera pitch v7, copia de revisión v8, guion v8 y PDFs de Entregable/.

Co-authored-by: Claude Sonnet 5.5 <noreply@anthropic.com>
</commit_message>
<xml_diff>
--- a/docs/specs/006-validacion-pitch-entrega/materiales/entregable-2/IstpetDev-Entregable-2-Solucion.docx
+++ b/docs/specs/006-validacion-pitch-entrega/materiales/entregable-2/IstpetDev-Entregable-2-Solucion.docx
@@ -1293,7 +1293,7 @@
           <w:color w:val="64748B"/>
           <w:sz w:val="17"/>
         </w:rPr>
-        <w:t>Figura 2. Planificación de rutas: seis vehículos, paradas numeradas sobre calles reales, ventanas horarias y hora estimada de llegada.</w:t>
+        <w:t>Figura 2. Planificación de rutas en la escena de demostración (datos sintéticos): paradas numeradas sobre calles reales, ventanas horarias y hora estimada de llegada.</w:t>
       </w:r>
     </w:p>
     <w:tbl>
@@ -1375,7 +1375,7 @@
                 <w:color w:val="64748B"/>
                 <w:sz w:val="17"/>
               </w:rPr>
-              <w:t>Figura 3. Consola de control: red de 80 centros de salud, riesgo de stock, rutas y custodia digital.</w:t>
+              <w:t>Figura 3. Consola de control con datos sintéticos: riesgo de stock, rutas y custodia digital.</w:t>
             </w:r>
           </w:p>
         </w:tc>
@@ -1963,7 +1963,7 @@
           <w:color w:val="2D3748"/>
           <w:sz w:val="21"/>
         </w:rPr>
-        <w:t>una región con unos 15 puntos y 2 vehículos. La escala de 80 puntos y 90 días se presenta como simulación con datos sintéticos.</w:t>
+        <w:t>una región con unos 15 puntos y 2 vehículos. La simulación de 90 días usa el escenario sintético de Quito (40 puntos) y no es una medición.</w:t>
       </w:r>
     </w:p>
     <w:p>

</xml_diff>